<commit_message>
docs: update authors to Soham Jadhav, Harsh Sawant, Aryan Talpade, Arham Ansari
</commit_message>
<xml_diff>
--- a/ShieldIntern-IEEE-Research-Paper.docx
+++ b/ShieldIntern-IEEE-Research-Paper.docx
@@ -37,7 +37,7 @@
         </w:rPr>
       </w:pPr>
       <w:r>
-        <w:t>Soham Jadhav</w:t>
+        <w:t>Soham Jadhav, Harsh Sawant</w:t>
         <w:br/>
         <w:t>Dept. of Computer Engineering</w:t>
         <w:br/>
@@ -45,7 +45,7 @@
         <w:br/>
         <w:t>Maharashtra, India</w:t>
         <w:br/>
-        <w:t>soham23busy@gmail.com</w:t>
+        <w:t>{soham23busy, harsh.sawant}@gmail.com</w:t>
       </w:r>
     </w:p>
     <w:p>
@@ -61,15 +61,15 @@
         </w:sectPr>
       </w:pPr>
       <w:r>
-        <w:t>Amey Bauchkar</w:t>
+        <w:t>Aryan Talpade, Arham Ansari</w:t>
         <w:br/>
-        <w:t>Dept. of Information Technology</w:t>
+        <w:t>Dept. of Computer Engineering</w:t>
         <w:br/>
         <w:t>University of Mumbai</w:t>
         <w:br/>
         <w:t>Maharashtra, India</w:t>
         <w:br/>
-        <w:t>amey.bauchkar@gmail.com</w:t>
+        <w:t>{aryan.talpade, arham.ansari}@gmail.com</w:t>
       </w:r>
     </w:p>
     <w:p>

</xml_diff>